<commit_message>
Sync all pending changes
</commit_message>
<xml_diff>
--- a/DevyaniPKumar-profile.docx
+++ b/DevyaniPKumar-profile.docx
@@ -28,7 +28,43 @@
           <w:color w:val="444466"/>
           <w:sz w:val="20"/>
         </w:rPr>
-        <w:t>Senior Lead Developer  ·  Solutions Architect  ·  Deloitte Digital</w:t>
+        <w:t xml:space="preserve">Senior Lead </w:t>
+      </w:r>
+      <w:proofErr w:type="gramStart"/>
+      <w:r>
+        <w:rPr>
+          <w:rFonts w:ascii="Calibri" w:hAnsi="Calibri"/>
+          <w:color w:val="444466"/>
+          <w:sz w:val="20"/>
+        </w:rPr>
+        <w:t>Developer  ·</w:t>
+      </w:r>
+      <w:proofErr w:type="gramEnd"/>
+      <w:r>
+        <w:rPr>
+          <w:rFonts w:ascii="Calibri" w:hAnsi="Calibri"/>
+          <w:color w:val="444466"/>
+          <w:sz w:val="20"/>
+        </w:rPr>
+        <w:t xml:space="preserve">  Solutions </w:t>
+      </w:r>
+      <w:proofErr w:type="gramStart"/>
+      <w:r>
+        <w:rPr>
+          <w:rFonts w:ascii="Calibri" w:hAnsi="Calibri"/>
+          <w:color w:val="444466"/>
+          <w:sz w:val="20"/>
+        </w:rPr>
+        <w:t>Architect  ·</w:t>
+      </w:r>
+      <w:proofErr w:type="gramEnd"/>
+      <w:r>
+        <w:rPr>
+          <w:rFonts w:ascii="Calibri" w:hAnsi="Calibri"/>
+          <w:color w:val="444466"/>
+          <w:sz w:val="20"/>
+        </w:rPr>
+        <w:t xml:space="preserve">  Deloitte Digital</w:t>
       </w:r>
     </w:p>
     <w:p>
@@ -68,7 +104,23 @@
             <w:rStyle w:val="Hyperlink"/>
             <w:sz w:val="18"/>
           </w:rPr>
-          <w:t>linkedin.com/in/devyani-p-kumar</w:t>
+          <w:t>linkedin.com/in/</w:t>
+        </w:r>
+        <w:proofErr w:type="spellStart"/>
+        <w:r>
+          <w:rPr>
+            <w:rStyle w:val="Hyperlink"/>
+            <w:sz w:val="18"/>
+          </w:rPr>
+          <w:t>devyani</w:t>
+        </w:r>
+        <w:proofErr w:type="spellEnd"/>
+        <w:r>
+          <w:rPr>
+            <w:rStyle w:val="Hyperlink"/>
+            <w:sz w:val="18"/>
+          </w:rPr>
+          <w:t>-p-kumar</w:t>
         </w:r>
       </w:hyperlink>
     </w:p>
@@ -133,7 +185,23 @@
           <w:rFonts w:ascii="Calibri" w:hAnsi="Calibri"/>
           <w:sz w:val="19"/>
         </w:rPr>
-        <w:t>Co-founded AR pipelines (open source AR frames library and toolkit to generate AR frameworks)</w:t>
+        <w:t>Co-founded AR pipelines (</w:t>
+      </w:r>
+      <w:proofErr w:type="gramStart"/>
+      <w:r>
+        <w:rPr>
+          <w:rFonts w:ascii="Calibri" w:hAnsi="Calibri"/>
+          <w:sz w:val="19"/>
+        </w:rPr>
+        <w:t>open source</w:t>
+      </w:r>
+      <w:proofErr w:type="gramEnd"/>
+      <w:r>
+        <w:rPr>
+          <w:rFonts w:ascii="Calibri" w:hAnsi="Calibri"/>
+          <w:sz w:val="19"/>
+        </w:rPr>
+        <w:t xml:space="preserve"> AR frames library and toolkit to generate AR frameworks)</w:t>
       </w:r>
     </w:p>
     <w:p>
@@ -176,7 +244,87 @@
           <w:rFonts w:ascii="Calibri" w:hAnsi="Calibri"/>
           <w:sz w:val="18"/>
         </w:rPr>
-        <w:t>SAP: CPQ, CPI, BTP, S4 HANA, Commerce Cloud, C4C, SAP AI Core, SAP Joule  |  AI/ML: LangChain, LangGraph, AWS Bedrock, RAG, Agentic AI, GPT-4, Gemini, WatsonX, Prompt Engineering  |  Backend: Python, FastAPI, .NET, GraphQL, REST APIs, PostgreSQL, Redis  |  Frontend: React, Next.js, TypeScript  |  Cloud: AWS, Docker, CI/CD  |  Other: AR/VR, IoT, Agile/Scrum</w:t>
+        <w:t xml:space="preserve">SAP: CPQ, CPI, BTP, S4 HANA, Commerce Cloud, C4C, SAP AI Core, SAP Joule  |  AI/ML: </w:t>
+      </w:r>
+      <w:proofErr w:type="spellStart"/>
+      <w:r>
+        <w:rPr>
+          <w:rFonts w:ascii="Calibri" w:hAnsi="Calibri"/>
+          <w:sz w:val="18"/>
+        </w:rPr>
+        <w:t>LangChain</w:t>
+      </w:r>
+      <w:proofErr w:type="spellEnd"/>
+      <w:r>
+        <w:rPr>
+          <w:rFonts w:ascii="Calibri" w:hAnsi="Calibri"/>
+          <w:sz w:val="18"/>
+        </w:rPr>
+        <w:t xml:space="preserve">, </w:t>
+      </w:r>
+      <w:proofErr w:type="spellStart"/>
+      <w:r>
+        <w:rPr>
+          <w:rFonts w:ascii="Calibri" w:hAnsi="Calibri"/>
+          <w:sz w:val="18"/>
+        </w:rPr>
+        <w:t>LangGraph</w:t>
+      </w:r>
+      <w:proofErr w:type="spellEnd"/>
+      <w:r>
+        <w:rPr>
+          <w:rFonts w:ascii="Calibri" w:hAnsi="Calibri"/>
+          <w:sz w:val="18"/>
+        </w:rPr>
+        <w:t xml:space="preserve">, AWS Bedrock, RAG, Agentic AI, GPT-4, Gemini, </w:t>
+      </w:r>
+      <w:proofErr w:type="spellStart"/>
+      <w:r>
+        <w:rPr>
+          <w:rFonts w:ascii="Calibri" w:hAnsi="Calibri"/>
+          <w:sz w:val="18"/>
+        </w:rPr>
+        <w:t>WatsonX</w:t>
+      </w:r>
+      <w:proofErr w:type="spellEnd"/>
+      <w:r>
+        <w:rPr>
+          <w:rFonts w:ascii="Calibri" w:hAnsi="Calibri"/>
+          <w:sz w:val="18"/>
+        </w:rPr>
+        <w:t xml:space="preserve">, Prompt Engineering  |  Backend: Python, </w:t>
+      </w:r>
+      <w:proofErr w:type="spellStart"/>
+      <w:r>
+        <w:rPr>
+          <w:rFonts w:ascii="Calibri" w:hAnsi="Calibri"/>
+          <w:sz w:val="18"/>
+        </w:rPr>
+        <w:t>FastAPI</w:t>
+      </w:r>
+      <w:proofErr w:type="spellEnd"/>
+      <w:r>
+        <w:rPr>
+          <w:rFonts w:ascii="Calibri" w:hAnsi="Calibri"/>
+          <w:sz w:val="18"/>
+        </w:rPr>
+        <w:t xml:space="preserve">, .NET, </w:t>
+      </w:r>
+      <w:proofErr w:type="spellStart"/>
+      <w:r>
+        <w:rPr>
+          <w:rFonts w:ascii="Calibri" w:hAnsi="Calibri"/>
+          <w:sz w:val="18"/>
+        </w:rPr>
+        <w:t>GraphQL</w:t>
+      </w:r>
+      <w:proofErr w:type="spellEnd"/>
+      <w:r>
+        <w:rPr>
+          <w:rFonts w:ascii="Calibri" w:hAnsi="Calibri"/>
+          <w:sz w:val="18"/>
+        </w:rPr>
+        <w:t>, REST APIs, PostgreSQL, Redis  |  Frontend: React, Next.js, TypeScript  |  Cloud: AWS, Docker, CI/CD  |  Other: AR/VR, IoT, Agile/Scrum</w:t>
       </w:r>
     </w:p>
     <w:p>
@@ -228,7 +376,16 @@
           <w:color w:val="555555"/>
           <w:sz w:val="19"/>
         </w:rPr>
-        <w:t xml:space="preserve">  |  </w:t>
+        <w:t xml:space="preserve">  </w:t>
+      </w:r>
+      <w:proofErr w:type="gramStart"/>
+      <w:r>
+        <w:rPr>
+          <w:rFonts w:ascii="Calibri" w:hAnsi="Calibri"/>
+          <w:color w:val="555555"/>
+          <w:sz w:val="19"/>
+        </w:rPr>
+        <w:t xml:space="preserve">|  </w:t>
       </w:r>
       <w:r>
         <w:rPr>
@@ -236,7 +393,25 @@
           <w:i/>
           <w:sz w:val="19"/>
         </w:rPr>
-        <w:t>Senior Developer</w:t>
+        <w:t>Senior</w:t>
+      </w:r>
+      <w:proofErr w:type="gramEnd"/>
+      <w:r>
+        <w:rPr>
+          <w:rFonts w:ascii="Calibri" w:hAnsi="Calibri"/>
+          <w:i/>
+          <w:sz w:val="19"/>
+        </w:rPr>
+        <w:t xml:space="preserve"> </w:t>
+      </w:r>
+      <w:proofErr w:type="gramStart"/>
+      <w:r>
+        <w:rPr>
+          <w:rFonts w:ascii="Calibri" w:hAnsi="Calibri"/>
+          <w:i/>
+          <w:sz w:val="19"/>
+        </w:rPr>
+        <w:t>Developer</w:t>
       </w:r>
       <w:r>
         <w:rPr>
@@ -244,7 +419,16 @@
           <w:color w:val="555555"/>
           <w:sz w:val="19"/>
         </w:rPr>
-        <w:t xml:space="preserve">  |  2024–2025 (1.5 Yr)</w:t>
+        <w:t xml:space="preserve">  |</w:t>
+      </w:r>
+      <w:proofErr w:type="gramEnd"/>
+      <w:r>
+        <w:rPr>
+          <w:rFonts w:ascii="Calibri" w:hAnsi="Calibri"/>
+          <w:color w:val="555555"/>
+          <w:sz w:val="19"/>
+        </w:rPr>
+        <w:t xml:space="preserve">  2024–2025 (1.5 Yr)</w:t>
       </w:r>
     </w:p>
     <w:p>
@@ -283,7 +467,16 @@
           <w:b/>
           <w:sz w:val="19"/>
         </w:rPr>
-        <w:t>IBM Software</w:t>
+        <w:t xml:space="preserve">IBM </w:t>
+      </w:r>
+      <w:proofErr w:type="gramStart"/>
+      <w:r>
+        <w:rPr>
+          <w:rFonts w:ascii="Calibri" w:hAnsi="Calibri"/>
+          <w:b/>
+          <w:sz w:val="19"/>
+        </w:rPr>
+        <w:t>Software</w:t>
       </w:r>
       <w:r>
         <w:rPr>
@@ -291,7 +484,16 @@
           <w:color w:val="555555"/>
           <w:sz w:val="19"/>
         </w:rPr>
-        <w:t xml:space="preserve">  |  </w:t>
+        <w:t xml:space="preserve">  |</w:t>
+      </w:r>
+      <w:proofErr w:type="gramEnd"/>
+      <w:r>
+        <w:rPr>
+          <w:rFonts w:ascii="Calibri" w:hAnsi="Calibri"/>
+          <w:color w:val="555555"/>
+          <w:sz w:val="19"/>
+        </w:rPr>
+        <w:t xml:space="preserve">  </w:t>
       </w:r>
       <w:r>
         <w:rPr>
@@ -299,7 +501,16 @@
           <w:i/>
           <w:sz w:val="19"/>
         </w:rPr>
-        <w:t>Lead Developer</w:t>
+        <w:t xml:space="preserve">Lead </w:t>
+      </w:r>
+      <w:proofErr w:type="gramStart"/>
+      <w:r>
+        <w:rPr>
+          <w:rFonts w:ascii="Calibri" w:hAnsi="Calibri"/>
+          <w:i/>
+          <w:sz w:val="19"/>
+        </w:rPr>
+        <w:t>Developer</w:t>
       </w:r>
       <w:r>
         <w:rPr>
@@ -307,7 +518,16 @@
           <w:color w:val="555555"/>
           <w:sz w:val="19"/>
         </w:rPr>
-        <w:t xml:space="preserve">  |  2021–2023 (2.5 Yr)</w:t>
+        <w:t xml:space="preserve">  |</w:t>
+      </w:r>
+      <w:proofErr w:type="gramEnd"/>
+      <w:r>
+        <w:rPr>
+          <w:rFonts w:ascii="Calibri" w:hAnsi="Calibri"/>
+          <w:color w:val="555555"/>
+          <w:sz w:val="19"/>
+        </w:rPr>
+        <w:t xml:space="preserve">  2021–2023 (2.5 Yr)</w:t>
       </w:r>
     </w:p>
     <w:p>
@@ -333,7 +553,23 @@
           <w:rFonts w:ascii="Calibri" w:hAnsi="Calibri"/>
           <w:sz w:val="19"/>
         </w:rPr>
-        <w:t>•  Shipped 15+ GraphQL/REST APIs connecting SAP CPQ to SFDC, Commerce Cloud, and middleware</w:t>
+        <w:t xml:space="preserve">•  Shipped 15+ </w:t>
+      </w:r>
+      <w:proofErr w:type="spellStart"/>
+      <w:r>
+        <w:rPr>
+          <w:rFonts w:ascii="Calibri" w:hAnsi="Calibri"/>
+          <w:sz w:val="19"/>
+        </w:rPr>
+        <w:t>GraphQL</w:t>
+      </w:r>
+      <w:proofErr w:type="spellEnd"/>
+      <w:r>
+        <w:rPr>
+          <w:rFonts w:ascii="Calibri" w:hAnsi="Calibri"/>
+          <w:sz w:val="19"/>
+        </w:rPr>
+        <w:t>/REST APIs connecting SAP CPQ to SFDC, Commerce Cloud, and middleware</w:t>
       </w:r>
     </w:p>
     <w:p>
@@ -346,7 +582,16 @@
           <w:b/>
           <w:sz w:val="19"/>
         </w:rPr>
-        <w:t>IBM Hardware</w:t>
+        <w:t xml:space="preserve">IBM </w:t>
+      </w:r>
+      <w:proofErr w:type="gramStart"/>
+      <w:r>
+        <w:rPr>
+          <w:rFonts w:ascii="Calibri" w:hAnsi="Calibri"/>
+          <w:b/>
+          <w:sz w:val="19"/>
+        </w:rPr>
+        <w:t>Hardware</w:t>
       </w:r>
       <w:r>
         <w:rPr>
@@ -354,23 +599,60 @@
           <w:color w:val="555555"/>
           <w:sz w:val="19"/>
         </w:rPr>
-        <w:t xml:space="preserve">  |  </w:t>
+        <w:t xml:space="preserve">  |</w:t>
+      </w:r>
+      <w:proofErr w:type="gramEnd"/>
+      <w:r>
+        <w:rPr>
+          <w:rFonts w:ascii="Calibri" w:hAnsi="Calibri"/>
+          <w:color w:val="555555"/>
+          <w:sz w:val="19"/>
+        </w:rPr>
+        <w:t xml:space="preserve">  </w:t>
+      </w:r>
+      <w:proofErr w:type="spellStart"/>
+      <w:r>
+        <w:rPr>
+          <w:rFonts w:ascii="Calibri" w:hAnsi="Calibri"/>
+          <w:i/>
+          <w:sz w:val="19"/>
+        </w:rPr>
+        <w:t>Fullstack</w:t>
+      </w:r>
+      <w:proofErr w:type="spellEnd"/>
+      <w:r>
+        <w:rPr>
+          <w:rFonts w:ascii="Calibri" w:hAnsi="Calibri"/>
+          <w:i/>
+          <w:sz w:val="19"/>
+        </w:rPr>
+        <w:t xml:space="preserve"> </w:t>
+      </w:r>
+      <w:proofErr w:type="gramStart"/>
+      <w:r>
+        <w:rPr>
+          <w:rFonts w:ascii="Calibri" w:hAnsi="Calibri"/>
+          <w:i/>
+          <w:sz w:val="19"/>
+        </w:rPr>
+        <w:t>Developer</w:t>
       </w:r>
       <w:r>
         <w:rPr>
           <w:rFonts w:ascii="Calibri" w:hAnsi="Calibri"/>
-          <w:i/>
-          <w:sz w:val="19"/>
-        </w:rPr>
-        <w:t>Fullstack Developer</w:t>
-      </w:r>
-      <w:r>
-        <w:rPr>
-          <w:rFonts w:ascii="Calibri" w:hAnsi="Calibri"/>
           <w:color w:val="555555"/>
           <w:sz w:val="19"/>
         </w:rPr>
-        <w:t xml:space="preserve">  |  2023–2024 (1 Yr)</w:t>
+        <w:t xml:space="preserve">  |</w:t>
+      </w:r>
+      <w:proofErr w:type="gramEnd"/>
+      <w:r>
+        <w:rPr>
+          <w:rFonts w:ascii="Calibri" w:hAnsi="Calibri"/>
+          <w:color w:val="555555"/>
+          <w:sz w:val="19"/>
+        </w:rPr>
+        <w:t xml:space="preserve">  2023–2024 (1 Yr)</w:t>
       </w:r>
     </w:p>
     <w:p>
@@ -383,7 +665,23 @@
           <w:rFonts w:ascii="Calibri" w:hAnsi="Calibri"/>
           <w:sz w:val="19"/>
         </w:rPr>
-        <w:t>•  Built 3D/AR visualization and WatsonX-powered product recommendations for hardware catalog</w:t>
+        <w:t xml:space="preserve">•  Built 3D/AR visualization and </w:t>
+      </w:r>
+      <w:proofErr w:type="spellStart"/>
+      <w:r>
+        <w:rPr>
+          <w:rFonts w:ascii="Calibri" w:hAnsi="Calibri"/>
+          <w:sz w:val="19"/>
+        </w:rPr>
+        <w:t>WatsonX</w:t>
+      </w:r>
+      <w:proofErr w:type="spellEnd"/>
+      <w:r>
+        <w:rPr>
+          <w:rFonts w:ascii="Calibri" w:hAnsi="Calibri"/>
+          <w:sz w:val="19"/>
+        </w:rPr>
+        <w:t>-powered product recommendations for hardware catalog</w:t>
       </w:r>
     </w:p>
     <w:p>
@@ -396,7 +694,16 @@
           <w:b/>
           <w:sz w:val="19"/>
         </w:rPr>
-        <w:t>Konica Minolta</w:t>
+        <w:t xml:space="preserve">Konica </w:t>
+      </w:r>
+      <w:proofErr w:type="gramStart"/>
+      <w:r>
+        <w:rPr>
+          <w:rFonts w:ascii="Calibri" w:hAnsi="Calibri"/>
+          <w:b/>
+          <w:sz w:val="19"/>
+        </w:rPr>
+        <w:t>Minolta</w:t>
       </w:r>
       <w:r>
         <w:rPr>
@@ -404,8 +711,18 @@
           <w:color w:val="555555"/>
           <w:sz w:val="19"/>
         </w:rPr>
-        <w:t xml:space="preserve">  |  </w:t>
+        <w:t xml:space="preserve">  |</w:t>
       </w:r>
+      <w:proofErr w:type="gramEnd"/>
+      <w:r>
+        <w:rPr>
+          <w:rFonts w:ascii="Calibri" w:hAnsi="Calibri"/>
+          <w:color w:val="555555"/>
+          <w:sz w:val="19"/>
+        </w:rPr>
+        <w:t xml:space="preserve">  </w:t>
+      </w:r>
+      <w:proofErr w:type="gramStart"/>
       <w:r>
         <w:rPr>
           <w:rFonts w:ascii="Calibri" w:hAnsi="Calibri"/>
@@ -420,7 +737,16 @@
           <w:color w:val="555555"/>
           <w:sz w:val="19"/>
         </w:rPr>
-        <w:t xml:space="preserve">  |  2021–2022 (9 Mo)</w:t>
+        <w:t xml:space="preserve">  |</w:t>
+      </w:r>
+      <w:proofErr w:type="gramEnd"/>
+      <w:r>
+        <w:rPr>
+          <w:rFonts w:ascii="Calibri" w:hAnsi="Calibri"/>
+          <w:color w:val="555555"/>
+          <w:sz w:val="19"/>
+        </w:rPr>
+        <w:t xml:space="preserve">  2021–2022 (9 Mo)</w:t>
       </w:r>
     </w:p>
     <w:p>
@@ -446,7 +772,16 @@
           <w:b/>
           <w:sz w:val="19"/>
         </w:rPr>
-        <w:t>FARO Technologies</w:t>
+        <w:t xml:space="preserve">FARO </w:t>
+      </w:r>
+      <w:proofErr w:type="gramStart"/>
+      <w:r>
+        <w:rPr>
+          <w:rFonts w:ascii="Calibri" w:hAnsi="Calibri"/>
+          <w:b/>
+          <w:sz w:val="19"/>
+        </w:rPr>
+        <w:t>Technologies</w:t>
       </w:r>
       <w:r>
         <w:rPr>
@@ -454,8 +789,18 @@
           <w:color w:val="555555"/>
           <w:sz w:val="19"/>
         </w:rPr>
-        <w:t xml:space="preserve">  |  </w:t>
+        <w:t xml:space="preserve">  |</w:t>
       </w:r>
+      <w:proofErr w:type="gramEnd"/>
+      <w:r>
+        <w:rPr>
+          <w:rFonts w:ascii="Calibri" w:hAnsi="Calibri"/>
+          <w:color w:val="555555"/>
+          <w:sz w:val="19"/>
+        </w:rPr>
+        <w:t xml:space="preserve">  </w:t>
+      </w:r>
+      <w:proofErr w:type="gramStart"/>
       <w:r>
         <w:rPr>
           <w:rFonts w:ascii="Calibri" w:hAnsi="Calibri"/>
@@ -470,7 +815,16 @@
           <w:color w:val="555555"/>
           <w:sz w:val="19"/>
         </w:rPr>
-        <w:t xml:space="preserve">  |  2022 (6 Mo)</w:t>
+        <w:t xml:space="preserve">  |</w:t>
+      </w:r>
+      <w:proofErr w:type="gramEnd"/>
+      <w:r>
+        <w:rPr>
+          <w:rFonts w:ascii="Calibri" w:hAnsi="Calibri"/>
+          <w:color w:val="555555"/>
+          <w:sz w:val="19"/>
+        </w:rPr>
+        <w:t xml:space="preserve">  2022 (6 Mo)</w:t>
       </w:r>
     </w:p>
     <w:p>
@@ -496,7 +850,16 @@
           <w:b/>
           <w:sz w:val="19"/>
         </w:rPr>
-        <w:t>Symetra 10x</w:t>
+        <w:t>Symetra 10</w:t>
+      </w:r>
+      <w:proofErr w:type="gramStart"/>
+      <w:r>
+        <w:rPr>
+          <w:rFonts w:ascii="Calibri" w:hAnsi="Calibri"/>
+          <w:b/>
+          <w:sz w:val="19"/>
+        </w:rPr>
+        <w:t>x</w:t>
       </w:r>
       <w:r>
         <w:rPr>
@@ -504,7 +867,16 @@
           <w:color w:val="555555"/>
           <w:sz w:val="19"/>
         </w:rPr>
-        <w:t xml:space="preserve">  |  </w:t>
+        <w:t xml:space="preserve">  |</w:t>
+      </w:r>
+      <w:proofErr w:type="gramEnd"/>
+      <w:r>
+        <w:rPr>
+          <w:rFonts w:ascii="Calibri" w:hAnsi="Calibri"/>
+          <w:color w:val="555555"/>
+          <w:sz w:val="19"/>
+        </w:rPr>
+        <w:t xml:space="preserve">  </w:t>
       </w:r>
       <w:r>
         <w:rPr>
@@ -512,7 +884,16 @@
           <w:i/>
           <w:sz w:val="19"/>
         </w:rPr>
-        <w:t>Senior Architect</w:t>
+        <w:t xml:space="preserve">Senior </w:t>
+      </w:r>
+      <w:proofErr w:type="gramStart"/>
+      <w:r>
+        <w:rPr>
+          <w:rFonts w:ascii="Calibri" w:hAnsi="Calibri"/>
+          <w:i/>
+          <w:sz w:val="19"/>
+        </w:rPr>
+        <w:t>Architect</w:t>
       </w:r>
       <w:r>
         <w:rPr>
@@ -520,7 +901,16 @@
           <w:color w:val="555555"/>
           <w:sz w:val="19"/>
         </w:rPr>
-        <w:t xml:space="preserve">  |  2026 (Ongoing)</w:t>
+        <w:t xml:space="preserve">  |</w:t>
+      </w:r>
+      <w:proofErr w:type="gramEnd"/>
+      <w:r>
+        <w:rPr>
+          <w:rFonts w:ascii="Calibri" w:hAnsi="Calibri"/>
+          <w:color w:val="555555"/>
+          <w:sz w:val="19"/>
+        </w:rPr>
+        <w:t xml:space="preserve">  2026 (Ongoing)</w:t>
       </w:r>
     </w:p>
     <w:p>
@@ -546,7 +936,16 @@
           <w:b/>
           <w:sz w:val="19"/>
         </w:rPr>
-        <w:t>AI Advantage (Disney, ESPN, BioMarin, FedEx)</w:t>
+        <w:t xml:space="preserve">AI Advantage (Disney, ESPN, BioMarin, </w:t>
+      </w:r>
+      <w:proofErr w:type="gramStart"/>
+      <w:r>
+        <w:rPr>
+          <w:rFonts w:ascii="Calibri" w:hAnsi="Calibri"/>
+          <w:b/>
+          <w:sz w:val="19"/>
+        </w:rPr>
+        <w:t>FedEx)</w:t>
       </w:r>
       <w:r>
         <w:rPr>
@@ -554,7 +953,16 @@
           <w:color w:val="555555"/>
           <w:sz w:val="19"/>
         </w:rPr>
-        <w:t xml:space="preserve">  |  </w:t>
+        <w:t xml:space="preserve">  |</w:t>
+      </w:r>
+      <w:proofErr w:type="gramEnd"/>
+      <w:r>
+        <w:rPr>
+          <w:rFonts w:ascii="Calibri" w:hAnsi="Calibri"/>
+          <w:color w:val="555555"/>
+          <w:sz w:val="19"/>
+        </w:rPr>
+        <w:t xml:space="preserve">  </w:t>
       </w:r>
       <w:r>
         <w:rPr>
@@ -562,7 +970,16 @@
           <w:i/>
           <w:sz w:val="19"/>
         </w:rPr>
-        <w:t>AI Architect</w:t>
+        <w:t xml:space="preserve">AI </w:t>
+      </w:r>
+      <w:proofErr w:type="gramStart"/>
+      <w:r>
+        <w:rPr>
+          <w:rFonts w:ascii="Calibri" w:hAnsi="Calibri"/>
+          <w:i/>
+          <w:sz w:val="19"/>
+        </w:rPr>
+        <w:t>Architect</w:t>
       </w:r>
       <w:r>
         <w:rPr>
@@ -570,7 +987,16 @@
           <w:color w:val="555555"/>
           <w:sz w:val="19"/>
         </w:rPr>
-        <w:t xml:space="preserve">  |  2025–2026</w:t>
+        <w:t xml:space="preserve">  |</w:t>
+      </w:r>
+      <w:proofErr w:type="gramEnd"/>
+      <w:r>
+        <w:rPr>
+          <w:rFonts w:ascii="Calibri" w:hAnsi="Calibri"/>
+          <w:color w:val="555555"/>
+          <w:sz w:val="19"/>
+        </w:rPr>
+        <w:t xml:space="preserve">  2025–2026</w:t>
       </w:r>
       <w:r>
         <w:rPr>
@@ -611,6 +1037,7 @@
       <w:pPr>
         <w:spacing w:before="50" w:after="0" w:line="230" w:lineRule="exact"/>
       </w:pPr>
+      <w:proofErr w:type="gramStart"/>
       <w:r>
         <w:rPr>
           <w:rFonts w:ascii="Calibri" w:hAnsi="Calibri"/>
@@ -625,7 +1052,16 @@
           <w:color w:val="555555"/>
           <w:sz w:val="19"/>
         </w:rPr>
-        <w:t xml:space="preserve">  |  </w:t>
+        <w:t xml:space="preserve">  |</w:t>
+      </w:r>
+      <w:proofErr w:type="gramEnd"/>
+      <w:r>
+        <w:rPr>
+          <w:rFonts w:ascii="Calibri" w:hAnsi="Calibri"/>
+          <w:color w:val="555555"/>
+          <w:sz w:val="19"/>
+        </w:rPr>
+        <w:t xml:space="preserve">  </w:t>
       </w:r>
       <w:r>
         <w:rPr>
@@ -633,7 +1069,16 @@
           <w:i/>
           <w:sz w:val="19"/>
         </w:rPr>
-        <w:t>Lead Developer</w:t>
+        <w:t xml:space="preserve">Lead </w:t>
+      </w:r>
+      <w:proofErr w:type="gramStart"/>
+      <w:r>
+        <w:rPr>
+          <w:rFonts w:ascii="Calibri" w:hAnsi="Calibri"/>
+          <w:i/>
+          <w:sz w:val="19"/>
+        </w:rPr>
+        <w:t>Developer</w:t>
       </w:r>
       <w:r>
         <w:rPr>
@@ -641,7 +1086,16 @@
           <w:color w:val="555555"/>
           <w:sz w:val="19"/>
         </w:rPr>
-        <w:t xml:space="preserve">  |  2025</w:t>
+        <w:t xml:space="preserve">  |</w:t>
+      </w:r>
+      <w:proofErr w:type="gramEnd"/>
+      <w:r>
+        <w:rPr>
+          <w:rFonts w:ascii="Calibri" w:hAnsi="Calibri"/>
+          <w:color w:val="555555"/>
+          <w:sz w:val="19"/>
+        </w:rPr>
+        <w:t xml:space="preserve">  2025</w:t>
       </w:r>
       <w:r>
         <w:rPr>
@@ -662,7 +1116,23 @@
           <w:rFonts w:ascii="Calibri" w:hAnsi="Calibri"/>
           <w:sz w:val="19"/>
         </w:rPr>
-        <w:t>•  Built automation pipeline cutting 80% manual effort; adopted as Deloitte firm-wide accelerator</w:t>
+        <w:t xml:space="preserve">•  Built automation pipeline cutting 80% manual </w:t>
+      </w:r>
+      <w:proofErr w:type="gramStart"/>
+      <w:r>
+        <w:rPr>
+          <w:rFonts w:ascii="Calibri" w:hAnsi="Calibri"/>
+          <w:sz w:val="19"/>
+        </w:rPr>
+        <w:t>effort;</w:t>
+      </w:r>
+      <w:proofErr w:type="gramEnd"/>
+      <w:r>
+        <w:rPr>
+          <w:rFonts w:ascii="Calibri" w:hAnsi="Calibri"/>
+          <w:sz w:val="19"/>
+        </w:rPr>
+        <w:t xml:space="preserve"> adopted as Deloitte firm-wide accelerator</w:t>
       </w:r>
     </w:p>
     <w:p>
@@ -675,7 +1145,16 @@
           <w:b/>
           <w:sz w:val="19"/>
         </w:rPr>
-        <w:t>SAP CX C2C — Deloitte</w:t>
+        <w:t xml:space="preserve">SAP CX C2C — </w:t>
+      </w:r>
+      <w:proofErr w:type="gramStart"/>
+      <w:r>
+        <w:rPr>
+          <w:rFonts w:ascii="Calibri" w:hAnsi="Calibri"/>
+          <w:b/>
+          <w:sz w:val="19"/>
+        </w:rPr>
+        <w:t>Deloitte</w:t>
       </w:r>
       <w:r>
         <w:rPr>
@@ -683,8 +1162,18 @@
           <w:color w:val="555555"/>
           <w:sz w:val="19"/>
         </w:rPr>
-        <w:t xml:space="preserve">  |  </w:t>
+        <w:t xml:space="preserve">  |</w:t>
       </w:r>
+      <w:proofErr w:type="gramEnd"/>
+      <w:r>
+        <w:rPr>
+          <w:rFonts w:ascii="Calibri" w:hAnsi="Calibri"/>
+          <w:color w:val="555555"/>
+          <w:sz w:val="19"/>
+        </w:rPr>
+        <w:t xml:space="preserve">  </w:t>
+      </w:r>
+      <w:proofErr w:type="gramStart"/>
       <w:r>
         <w:rPr>
           <w:rFonts w:ascii="Calibri" w:hAnsi="Calibri"/>
@@ -699,7 +1188,16 @@
           <w:color w:val="555555"/>
           <w:sz w:val="19"/>
         </w:rPr>
-        <w:t xml:space="preserve">  |  2025–2026</w:t>
+        <w:t xml:space="preserve">  |</w:t>
+      </w:r>
+      <w:proofErr w:type="gramEnd"/>
+      <w:r>
+        <w:rPr>
+          <w:rFonts w:ascii="Calibri" w:hAnsi="Calibri"/>
+          <w:color w:val="555555"/>
+          <w:sz w:val="19"/>
+        </w:rPr>
+        <w:t xml:space="preserve">  2025–2026</w:t>
       </w:r>
       <w:r>
         <w:rPr>
@@ -777,20 +1275,40 @@
           <w:color w:val="555555"/>
           <w:sz w:val="19"/>
         </w:rPr>
-        <w:t xml:space="preserve">, CMI (Ongoing)    </w:t>
+        <w:t xml:space="preserve"> </w:t>
+      </w:r>
+      <w:r>
+        <w:rPr>
+          <w:rFonts w:ascii="Calibri" w:hAnsi="Calibri"/>
+          <w:color w:val="555555"/>
+          <w:sz w:val="19"/>
+        </w:rPr>
+        <w:t xml:space="preserve">(Ongoing)    </w:t>
       </w:r>
     </w:p>
     <w:p>
       <w:pPr>
         <w:spacing w:after="0" w:line="220" w:lineRule="exact"/>
       </w:pPr>
+      <w:proofErr w:type="spellStart"/>
+      <w:proofErr w:type="gramStart"/>
       <w:r>
         <w:rPr>
           <w:rFonts w:ascii="Calibri" w:hAnsi="Calibri"/>
           <w:b/>
           <w:sz w:val="19"/>
         </w:rPr>
-        <w:t>B.Tech Computer Science</w:t>
+        <w:t>B.Tech</w:t>
+      </w:r>
+      <w:proofErr w:type="spellEnd"/>
+      <w:proofErr w:type="gramEnd"/>
+      <w:r>
+        <w:rPr>
+          <w:rFonts w:ascii="Calibri" w:hAnsi="Calibri"/>
+          <w:b/>
+          <w:sz w:val="19"/>
+        </w:rPr>
+        <w:t xml:space="preserve"> Computer Science</w:t>
       </w:r>
       <w:r>
         <w:rPr>
@@ -798,7 +1316,7 @@
           <w:color w:val="555555"/>
           <w:sz w:val="19"/>
         </w:rPr>
-        <w:t xml:space="preserve"> (Cognitive Computing), IIIT Delhi</w:t>
+        <w:t xml:space="preserve"> (Cognitive Computing)</w:t>
       </w:r>
     </w:p>
     <w:p>
@@ -868,7 +1386,23 @@
           <w:rFonts w:ascii="Calibri" w:hAnsi="Calibri"/>
           <w:sz w:val="19"/>
         </w:rPr>
-        <w:t>•  AI Innovator — Production GenAI (RAG, agentic, LLM orchestration) serving 4 Fortune 500 clients</w:t>
+        <w:t xml:space="preserve">•  AI Innovator — Production GenAI (RAG, </w:t>
+      </w:r>
+      <w:proofErr w:type="gramStart"/>
+      <w:r>
+        <w:rPr>
+          <w:rFonts w:ascii="Calibri" w:hAnsi="Calibri"/>
+          <w:sz w:val="19"/>
+        </w:rPr>
+        <w:t>agentic</w:t>
+      </w:r>
+      <w:proofErr w:type="gramEnd"/>
+      <w:r>
+        <w:rPr>
+          <w:rFonts w:ascii="Calibri" w:hAnsi="Calibri"/>
+          <w:sz w:val="19"/>
+        </w:rPr>
+        <w:t>, LLM orchestration) serving 4 Fortune 500 clients</w:t>
       </w:r>
     </w:p>
     <w:p>
@@ -881,7 +1415,23 @@
           <w:rFonts w:ascii="Calibri" w:hAnsi="Calibri"/>
           <w:sz w:val="19"/>
         </w:rPr>
-        <w:t>•  SANOFI Accelerator — GenAI solution adopted as Deloitte firm-wide accelerator (500+ hrs saved)</w:t>
+        <w:t xml:space="preserve">•  SANOFI Accelerator — GenAI solution adopted as Deloitte firm-wide accelerator (500+ </w:t>
+      </w:r>
+      <w:proofErr w:type="spellStart"/>
+      <w:r>
+        <w:rPr>
+          <w:rFonts w:ascii="Calibri" w:hAnsi="Calibri"/>
+          <w:sz w:val="19"/>
+        </w:rPr>
+        <w:t>hrs</w:t>
+      </w:r>
+      <w:proofErr w:type="spellEnd"/>
+      <w:r>
+        <w:rPr>
+          <w:rFonts w:ascii="Calibri" w:hAnsi="Calibri"/>
+          <w:sz w:val="19"/>
+        </w:rPr>
+        <w:t xml:space="preserve"> saved)</w:t>
       </w:r>
     </w:p>
     <w:sectPr>

</xml_diff>